<commit_message>
pdf of solving assignment
</commit_message>
<xml_diff>
--- a/solving-assignment.docx
+++ b/solving-assignment.docx
@@ -27,14 +27,7 @@
         <w:rPr>
           <w:sz w:val="24"/>
         </w:rPr>
-        <w:t xml:space="preserve">, </w:t>
-      </w:r>
-      <w:proofErr w:type="gramStart"/>
-      <w:r>
-        <w:rPr>
-          <w:sz w:val="24"/>
-        </w:rPr>
-        <w:t>202</w:t>
+        <w:t>, 202</w:t>
       </w:r>
       <w:r>
         <w:rPr>
@@ -42,7 +35,6 @@
         </w:rPr>
         <w:t>6</w:t>
       </w:r>
-      <w:proofErr w:type="gramEnd"/>
       <w:r>
         <w:rPr>
           <w:sz w:val="24"/>
@@ -61,34 +53,7 @@
           <w:sz w:val="24"/>
         </w:rPr>
         <w:tab/>
-      </w:r>
-      <w:proofErr w:type="spellStart"/>
-      <w:r>
-        <w:rPr>
-          <w:sz w:val="24"/>
-        </w:rPr>
-        <w:t>ppp</w:t>
-      </w:r>
-      <w:proofErr w:type="spellEnd"/>
-      <w:r>
-        <w:rPr>
-          <w:sz w:val="24"/>
-        </w:rPr>
-        <w:t>-psb-</w:t>
-      </w:r>
-      <w:proofErr w:type="spellStart"/>
-      <w:r>
-        <w:rPr>
-          <w:sz w:val="24"/>
-        </w:rPr>
-        <w:t>srh</w:t>
-      </w:r>
-      <w:proofErr w:type="spellEnd"/>
-      <w:r>
-        <w:rPr>
-          <w:sz w:val="24"/>
-        </w:rPr>
-        <w:t xml:space="preserve"> </w:t>
+        <w:t xml:space="preserve">ppp-psb-srh </w:t>
       </w:r>
     </w:p>
     <w:p>
@@ -101,16 +66,7 @@
         <w:ind w:left="3992" w:hanging="2929"/>
       </w:pPr>
       <w:r>
-        <w:t xml:space="preserve">CV </w:t>
-      </w:r>
-      <w:r>
-        <w:t>510</w:t>
-      </w:r>
-      <w:r>
-        <w:t>1</w:t>
-      </w:r>
-      <w:r>
-        <w:t>: Steps to download, solve, and submit</w:t>
+        <w:t>CV 5101: Steps to download, solve, and submit</w:t>
       </w:r>
       <w:r>
         <w:rPr>
@@ -139,7 +95,13 @@
         <w:ind w:hanging="420"/>
       </w:pPr>
       <w:r>
-        <w:t xml:space="preserve">Browse to cv-5100 GitHub repo. </w:t>
+        <w:t>Browse to cv-510</w:t>
+      </w:r>
+      <w:r>
+        <w:t>1</w:t>
+      </w:r>
+      <w:r>
+        <w:t xml:space="preserve"> GitHub repo. </w:t>
       </w:r>
       <w:hyperlink r:id="rId5">
         <w:r>
@@ -175,21 +137,7 @@
             <w:color w:val="467886"/>
             <w:u w:val="single" w:color="467886"/>
           </w:rPr>
-          <w:t>202</w:t>
-        </w:r>
-        <w:r>
-          <w:rPr>
-            <w:color w:val="467886"/>
-            <w:u w:val="single" w:color="467886"/>
-          </w:rPr>
-          <w:t>6</w:t>
-        </w:r>
-        <w:r>
-          <w:rPr>
-            <w:color w:val="467886"/>
-            <w:u w:val="single" w:color="467886"/>
-          </w:rPr>
-          <w:t>/CV</w:t>
+          <w:t>2026/CV</w:t>
         </w:r>
       </w:hyperlink>
       <w:hyperlink r:id="rId10">
@@ -207,14 +155,7 @@
             <w:color w:val="467886"/>
             <w:u w:val="single" w:color="467886"/>
           </w:rPr>
-          <w:t>51</w:t>
-        </w:r>
-        <w:r>
-          <w:rPr>
-            <w:color w:val="467886"/>
-            <w:u w:val="single" w:color="467886"/>
-          </w:rPr>
-          <w:t>01</w:t>
+          <w:t>5101</w:t>
         </w:r>
       </w:hyperlink>
       <w:hyperlink r:id="rId12">

</xml_diff>